<commit_message>
fix: ajout références articles AUSCGIE dans requête désignation commissaire apports
Articles 312 (SA), 400 (SARL), 694 (choix parmi CAC inscrits/experts-comptables agréés),
délai de dépôt au greffe (8 jours avant AGE).

Co-Authored-By: Claude Opus 4.6 (1M context) <noreply@anthropic.com>
</commit_message>
<xml_diff>
--- a/server/templates/requete-designation-cac/requete.docx
+++ b/server/templates/requete-designation-cac/requete.docx
@@ -345,7 +345,75 @@
           <w:sz w:val="24"/>
           <w:szCs w:val="24"/>
         </w:rPr>
-        <w:t xml:space="preserve">Que conformément aux dispositions des articles {articles_reference} de l’Acte uniforme relatif au droit des sociétés commerciales et du groupement d’intérêt économique (AUSCGIE), il est obligatoire de faire évaluer les apports en nature par un commissaire aux apports désigné par la juridiction compétente.</w:t>
+        <w:t xml:space="preserve">Que conformément aux dispositions de l’article 312 (pour les SA) ou 400 (pour les SARL) de l’Acte Uniforme relatif au Droit des Sociétés Commerciales et du GIE, les apports en nature doivent être évalués par un commissaire aux apports désigné à l’unanimité des actionnaires ou à défaut par le président de la juridiction compétente.</w:t>
+      </w:r>
+    </w:p>
+    <w:p>
+      <w:pPr>
+        <w:jc w:val="both"/>
+        <w:spacing w:after="120" w:line="276" w:lineRule="auto"/>
+        <w:rPr>
+          <w:rFonts w:ascii="Times New Roman" w:hAnsi="Times New Roman" w:cs="Times New Roman"/>
+        </w:rPr>
+      </w:pPr>
+      <w:r>
+        <w:rPr>
+          <w:rFonts w:ascii="Times New Roman" w:hAnsi="Times New Roman" w:cs="Times New Roman"/>
+          <w:sz w:val="24"/>
+          <w:szCs w:val="24"/>
+        </w:rPr>
+        <w:t xml:space="preserve"/>
+      </w:r>
+    </w:p>
+    <w:p>
+      <w:pPr>
+        <w:jc w:val="both"/>
+        <w:spacing w:after="120" w:line="276" w:lineRule="auto"/>
+        <w:rPr>
+          <w:rFonts w:ascii="Times New Roman" w:hAnsi="Times New Roman" w:cs="Times New Roman"/>
+        </w:rPr>
+      </w:pPr>
+      <w:r>
+        <w:rPr>
+          <w:rFonts w:ascii="Times New Roman" w:hAnsi="Times New Roman" w:cs="Times New Roman"/>
+          <w:sz w:val="24"/>
+          <w:szCs w:val="24"/>
+        </w:rPr>
+        <w:t xml:space="preserve">Que conformément à l’article 694 de l’AUSCGIE, le commissaire aux apports est choisi parmi les commissaires aux comptes inscrits ou les experts comptables agréés.</w:t>
+      </w:r>
+    </w:p>
+    <w:p>
+      <w:pPr>
+        <w:jc w:val="both"/>
+        <w:spacing w:after="120" w:line="276" w:lineRule="auto"/>
+        <w:rPr>
+          <w:rFonts w:ascii="Times New Roman" w:hAnsi="Times New Roman" w:cs="Times New Roman"/>
+        </w:rPr>
+      </w:pPr>
+      <w:r>
+        <w:rPr>
+          <w:rFonts w:ascii="Times New Roman" w:hAnsi="Times New Roman" w:cs="Times New Roman"/>
+          <w:sz w:val="24"/>
+          <w:szCs w:val="24"/>
+        </w:rPr>
+        <w:t xml:space="preserve"/>
+      </w:r>
+    </w:p>
+    <w:p>
+      <w:pPr>
+        <w:jc w:val="both"/>
+        <w:spacing w:after="120" w:line="276" w:lineRule="auto"/>
+        <w:rPr>
+          <w:rFonts w:ascii="Times New Roman" w:hAnsi="Times New Roman" w:cs="Times New Roman"/>
+        </w:rPr>
+      </w:pPr>
+      <w:r>
+        <w:rPr>
+          <w:rFonts w:ascii="Times New Roman" w:hAnsi="Times New Roman" w:cs="Times New Roman"/>
+          <w:sz w:val="24"/>
+          <w:szCs w:val="24"/>
+        </w:rPr>
+        <w:t xml:space="preserve">Que le rapport du commissaire aux apports doit être déposé au greffe du tribunal chargé des affaires commerciales et au siège social de la société huit jours au moins avant la date de l’assemblée générale extraordinaire.</w:t>
       </w:r>
     </w:p>
     <w:p>
@@ -414,7 +482,7 @@
           <w:sz w:val="24"/>
           <w:szCs w:val="24"/>
         </w:rPr>
-        <w:t xml:space="preserve">Le requérant a l’honneur de vous demander de bien vouloir désigner un commissaire aux apports, choisi parmi les experts-comptables agréés ou les experts judiciaires, aux fins de :</w:t>
+        <w:t xml:space="preserve">Le requérant a l’honneur de vous demander de bien vouloir désigner, conformément à l’article 694 de l’AUSCGIE, un commissaire aux apports choisi parmi les commissaires aux comptes inscrits ou les experts-comptables agréés, avec pour mission :</w:t>
       </w:r>
     </w:p>
     <w:p>

</xml_diff>